<commit_message>
Data checker by the founder or a volunteer (year one LKR 78,100); tables flow across pages without gaps
Co-Authored-By: Claude Opus 5.5 (1M context) <noreply@anthropic.com>
</commit_message>
<xml_diff>
--- a/ZedPath_AI_Usage_Report.docx
+++ b/ZedPath_AI_Usage_Report.docx
@@ -590,10 +590,10 @@
         <w:rPr>
           <w:b/>
         </w:rPr>
-        <w:t>42,937 places</w:t>
+        <w:t xml:space="preserve">University seats: </w:t>
       </w:r>
       <w:r>
-        <w:t xml:space="preserve"> was rebuilt from our own extraction of the handbook (42,037 Uni-Code places + 900 additional Arts places) and matched exactly.</w:t>
+        <w:t>we added up the seats for every degree listed in the official UGC handbook ourselves and got the same national total the UGC publishes, 42,937.</w:t>
       </w:r>
     </w:p>
     <w:p>
@@ -602,7 +602,13 @@
         <w:spacing w:after="20"/>
       </w:pPr>
       <w:r>
-        <w:t>Cut-offs: 6,500 district cells extracted by two methods with 0 mismatches, 14 checked by eye against the printed pages. Syllabus titles were compared word for word with the university pages.</w:t>
+        <w:rPr>
+          <w:b/>
+        </w:rPr>
+        <w:t xml:space="preserve">Minimum Z-scores: </w:t>
+      </w:r>
+      <w:r>
+        <w:t>we read every past minimum Z-score (each degree, in each of the 25 districts) out of the official tables twice, by two different methods; the two copies agreed on every number, and we checked a sample by eye against the printed pages. Course subjects shown in the app were compared word for word with the universities' own pages.</w:t>
       </w:r>
     </w:p>
     <w:p>
@@ -881,7 +887,7 @@
         <w:rPr>
           <w:b/>
         </w:rPr>
-        <w:t>LKR 10 per student a year</w:t>
+        <w:t>LKR 8 per student a year</w:t>
       </w:r>
       <w:r>
         <w:t>. The eligibility rules and Safe/Likely/Reach bands use no AI at runtime: they come from our tested rule engine, so the AI never decides a student's chances.</w:t>

</xml_diff>